<commit_message>
Rewrite diabetic retinopathy overview
</commit_message>
<xml_diff>
--- a/graduation.docx
+++ b/graduation.docx
@@ -18,27 +18,7 @@
         <w:spacing w:line="408" w:lineRule="auto" w:after="160"/>
       </w:pPr>
       <w:r>
-        <w:t xml:space="preserve">당뇨망막병증은 지속적인 고혈당이 망막의 미세혈관을 손상시키면서 발생하는 대표적인 당뇨병성 합병증으로, 질환이 진행될수록 망막 순환 장애와 구조적 손상이 단계적으로 심화된다. 고혈당에 장기간 노출된 모세혈관은 혈관벽과 혈액-망막 장벽의 기능이 저하되어 투과성이 증가하며, 그 결과 망막 내 출혈과 삼출물, 부종 등이 나타날 수 있다. 나아가 모세혈관 폐쇄가 광범위해지면 망막 조직에 허혈과 저산소 상태가 형성되고, 이를 보상하기 위한 비정상적인 신생혈관이 발생한다. 그러나 이러한 신생혈관은 정상 혈관보다 취약하므로 유리체출혈을 일으키기 쉽고, 섬유혈관 조직의 수축이 견인망막박리로 이어질 경우 회복하기 어려운 시력 손상이나 실명을 초래할 수 있다.</w:t>
-      </w:r>
-    </w:p>
-    <w:p>
-      <w:pPr>
-        <w:jc w:val="both"/>
-        <w:ind w:firstLineChars="200"/>
-        <w:spacing w:line="408" w:lineRule="auto" w:after="160"/>
-      </w:pPr>
-      <w:r>
-        <w:t xml:space="preserve">이와 같은 병태생리의 근본에는 당뇨병으로 인한 만성적인 대사 이상이 존재한다. 장기간 지속되는 고혈당은 미세혈관계뿐 아니라 신경 조직에도 복합적인 손상을 유발하며, 눈에서는 이러한 전신적 손상이 망막 순환 장애와 신경망막 기능 저하의 형태로 나타난다. 따라서 당뇨망막병증은 당뇨병성 신경병증 및 당뇨병성 신증과 함께 당뇨병의 대표적인 미세혈관 합병증으로 분류된다. 다만 발병 여부와 진행 속도는 혈당 수준만으로 결정되지 않으며, 당뇨병의 유병 기간과 혈당 조절 상태를 중심으로 고혈압, 이상지질혈증 및 신장 기능 저하 등 여러 위험 요인이 상호작용한다. 즉, 동일한 당뇨병 환자라도 대사 조절 상태와 동반질환에 따라 망막 손상의 정도와 진행 양상이 달라질 수 있다.</w:t>
-      </w:r>
-    </w:p>
-    <w:p>
-      <w:pPr>
-        <w:jc w:val="both"/>
-        <w:ind w:firstLineChars="200"/>
-        <w:spacing w:line="408" w:lineRule="auto" w:after="160"/>
-      </w:pPr>
-      <w:r>
-        <w:t xml:space="preserve">문제는 이러한 병리적 변화가 상당히 진행되는 동안에도 환자가 뚜렷한 증상을 느끼지 못할 수 있다는 점이다. 초기 비증식당뇨망막병증에서는 미세혈관류, 점상출혈 및 삼출물 등의 소견이 나타나더라도 중심 시력이 유지될 수 있어, 자각 증상만으로 질환의 존재를 판단하기 어렵다. 이후 시력을 직접 담당하는 황반부에 부종이 발생하면 시야가 흐려지고 읽기나 운전과 같은 일상 활동에 어려움이 생길 수 있으며, 증식당뇨망막병증으로 진행할수록 신생혈관과 출혈에 따른 급격한 시력 저하의 위험도 증가한다. 이처럼 증상의 발생 시점과 망막 병변의 진행 정도가 반드시 일치하지 않기 때문에, 당뇨병 환자에서는 증상 유무와 관계없이 정기적인 안저검사를 시행하여 병변을 조기에 발견하고 적절한 치료 시기를 결정하는 것이 중요하다.</w:t>
+        <w:t xml:space="preserve">당뇨망막병증은 장기간 지속되는 고혈당이 망막의 미세혈관과 혈액-망막 장벽을 손상시키면서 발생하는 대표적인 당뇨병성 미세혈관 합병증이다. 혈관 투과성이 증가하면 미세혈관류, 망막출혈, 삼출물 및 황반부종이 나타나고, 모세혈관 폐쇄가 확대되어 망막 허혈이 심화되면 이를 보상하기 위한 비정상적인 신생혈관이 형성되는데, 이러한 혈관은 구조적으로 취약하여 유리체출혈이나 견인망막박리를 일으키고 결국 회복하기 어려운 시력 저하와 실명으로 이어질 수 있다. 더욱이 초기에는 병변이 존재하더라도 중심 시력이 유지되어 환자가 뚜렷한 증상을 느끼지 못하는 경우가 많으므로, 자각 증상이 나타난 뒤 검사를 시행하는 방식만으로는 적절한 치료 시기를 놓칠 위험이 크다. 따라서 동공을 통해 망막과 망막혈관의 상태를 직접 관찰하는 안저검사는 미세혈관류, 출혈, 삼출물 및 신생혈관과 같은 주요 병변을 비침습적으로 확인하고 질환의 유무와 중증도를 평가할 수 있다는 점에서 매우 효과적이다. 특히 안저 촬영으로 획득한 영상은 검사 결과를 객관적으로 기록하여 시간에 따른 병변 변화를 비교하고 전문의 간 판독과 추적 관찰을 지원할 수 있으므로, 무증상 단계의 조기 발견부터 치료 개입 시점의 결정 및 진행 억제에 이르기까지 당뇨망막병증으로 인한 시력 손실을 예방하는 데 필수적인 임상적 근거를 제공한다.</w:t>
       </w:r>
     </w:p>
     <w:p>

</xml_diff>